<commit_message>
Withdraw dissertation PDF and redact newspaper images in public editions
</commit_message>
<xml_diff>
--- a/transcript/Syntheticism-Defence-21-September-2026-Reading-Edition.docx
+++ b/transcript/Syntheticism-Defence-21-September-2026-Reading-Edition.docx
@@ -349,75 +349,63 @@
       <w:r>
         <w:t xml:space="preserve">On this navigational triangle, my developed core concepts of Algorithmic Representation, Technosocial Sculpture and Syntheticism name the conceptual vertices; The Synthetic Party, the Synthetic Summits and democracy name the practice-edges. </w:t>
       </w:r>
-      <w:hyperlink r:id="rId11" w:tooltip="Article 1: The Synthetic Party &amp; Leader Lars: On Algorithmic Representation within Political Democracy; printed pp. 135–155">
-        <w:r>
-          <w:rPr>
-            <w:color w:val="000000"/>
-            <w:u w:val="single"/>
-          </w:rPr>
-          <w:t xml:space="preserve">Articles 1</w:t>
-        </w:r>
-      </w:hyperlink>
+      <w:r>
+        <w:rPr>
+          <w:color w:val="000000"/>
+          <w:u w:val="single"/>
+        </w:rPr>
+        <w:t xml:space="preserve">Articles 1</w:t>
+      </w:r>
       <w:r>
         <w:t>–</w:t>
       </w:r>
-      <w:hyperlink r:id="rId12" w:tooltip="Article 2: A Model for Proustian Decay: Estimating the Value of Intelligence in the Age of Unreason; printed pp. 157–177">
-        <w:r>
-          <w:rPr>
-            <w:color w:val="000000"/>
-            <w:u w:val="single"/>
-          </w:rPr>
-          <w:t xml:space="preserve">2</w:t>
-        </w:r>
-      </w:hyperlink>
+      <w:r>
+        <w:rPr>
+          <w:color w:val="000000"/>
+          <w:u w:val="single"/>
+        </w:rPr>
+        <w:t xml:space="preserve">2</w:t>
+      </w:r>
       <w:r>
         <w:t xml:space="preserve">, </w:t>
       </w:r>
-      <w:hyperlink r:id="rId13" w:tooltip="Article 3: Isaac Asimov’s Incubation of Political AI: An Immanent Critique?; printed pp. 180–205">
-        <w:r>
-          <w:rPr>
-            <w:color w:val="000000"/>
-            <w:u w:val="single"/>
-          </w:rPr>
-          <w:t xml:space="preserve">3</w:t>
-        </w:r>
-      </w:hyperlink>
+      <w:r>
+        <w:rPr>
+          <w:color w:val="000000"/>
+          <w:u w:val="single"/>
+        </w:rPr>
+        <w:t xml:space="preserve">3</w:t>
+      </w:r>
       <w:r>
         <w:t>–</w:t>
       </w:r>
-      <w:hyperlink r:id="rId14" w:tooltip="Article 5: Scripting the Spectacle: A Theory Tragedy; printed pp. 235–265">
-        <w:r>
-          <w:rPr>
-            <w:color w:val="000000"/>
-            <w:u w:val="single"/>
-          </w:rPr>
-          <w:t xml:space="preserve">5</w:t>
-        </w:r>
-      </w:hyperlink>
+      <w:r>
+        <w:rPr>
+          <w:color w:val="000000"/>
+          <w:u w:val="single"/>
+        </w:rPr>
+        <w:t xml:space="preserve">5</w:t>
+      </w:r>
       <w:r>
         <w:t xml:space="preserve"> and </w:t>
       </w:r>
-      <w:hyperlink r:id="rId15" w:tooltip="Article 6: Synthetic Chamber: Agentic Mediation in Representative Democracy; printed pp. 268–294">
-        <w:r>
-          <w:rPr>
-            <w:color w:val="000000"/>
-            <w:u w:val="single"/>
-          </w:rPr>
-          <w:t xml:space="preserve">6</w:t>
-        </w:r>
-      </w:hyperlink>
+      <w:r>
+        <w:rPr>
+          <w:color w:val="000000"/>
+          <w:u w:val="single"/>
+        </w:rPr>
+        <w:t xml:space="preserve">6</w:t>
+      </w:r>
       <w:r>
         <w:t>–</w:t>
       </w:r>
-      <w:hyperlink r:id="rId16" w:tooltip="Article 7: Democracy as a Governance Algorithm: A Constraint Hierarchy for the AI Society; printed pp. 296–324">
-        <w:r>
-          <w:rPr>
-            <w:color w:val="000000"/>
-            <w:u w:val="single"/>
-          </w:rPr>
-          <w:t xml:space="preserve">7</w:t>
-        </w:r>
-      </w:hyperlink>
+      <w:r>
+        <w:rPr>
+          <w:color w:val="000000"/>
+          <w:u w:val="single"/>
+        </w:rPr>
+        <w:t xml:space="preserve">7</w:t>
+      </w:r>
       <w:r>
         <w:t xml:space="preserve"> follow those three</w:t>
       </w:r>
@@ -569,15 +557,13 @@
       <w:r>
         <w:t xml:space="preserve">The party’s own datasets, visualisations and reception enter as the material of </w:t>
       </w:r>
-      <w:hyperlink r:id="rId11" w:tooltip="Article 1: The Synthetic Party &amp; Leader Lars: On Algorithmic Representation within Political Democracy; printed pp. 135–155">
-        <w:r>
-          <w:rPr>
-            <w:color w:val="000000"/>
-            <w:u w:val="single"/>
-          </w:rPr>
-          <w:t xml:space="preserve">Article 1</w:t>
-        </w:r>
-      </w:hyperlink>
+      <w:r>
+        <w:rPr>
+          <w:color w:val="000000"/>
+          <w:u w:val="single"/>
+        </w:rPr>
+        <w:t xml:space="preserve">Article 1</w:t>
+      </w:r>
       <w:r>
         <w:t>, a dialogic insider-analysis between me and Computer Lars. Here Text2Emotion renders Leader Lars predominantly through anger, and those labelled “party members” predominantly through fear. The political object describes and measures itself, while its affective appearance changes with the instrument used to classify it.</w:t>
       </w:r>
@@ -601,15 +587,13 @@
       <w:r>
         <w:t xml:space="preserve">That register reverses in </w:t>
       </w:r>
-      <w:hyperlink r:id="rId12" w:tooltip="Article 2: A Model for Proustian Decay: Estimating the Value of Intelligence in the Age of Unreason; printed pp. 157–177">
-        <w:r>
-          <w:rPr>
-            <w:color w:val="000000"/>
-            <w:u w:val="single"/>
-          </w:rPr>
-          <w:t xml:space="preserve">Article 2</w:t>
-        </w:r>
-      </w:hyperlink>
+      <w:r>
+        <w:rPr>
+          <w:color w:val="000000"/>
+          <w:u w:val="single"/>
+        </w:rPr>
+        <w:t xml:space="preserve">Article 2</w:t>
+      </w:r>
       <w:r>
         <w:t>, a speculative mathematical essay written with the signature of Computer Lars. The axes read “Days from Proust’s Birth” and “Estimation of Intelligence (%)”. I turn a sentence from Marcel Proust, whose name Computer Lars anagrams, into a premise for stipulating that scale.</w:t>
       </w:r>
@@ -729,15 +713,13 @@
       <w:r>
         <w:t xml:space="preserve">By </w:t>
       </w:r>
-      <w:hyperlink r:id="rId17" w:tooltip="Article 4: Deep Faking in a Flat Reality?; printed pp. 207–233">
-        <w:r>
-          <w:rPr>
-            <w:color w:val="000000"/>
-            <w:u w:val="single"/>
-          </w:rPr>
-          <w:t xml:space="preserve">Article 4</w:t>
-        </w:r>
-      </w:hyperlink>
+      <w:r>
+        <w:rPr>
+          <w:color w:val="000000"/>
+          <w:u w:val="single"/>
+        </w:rPr>
+        <w:t xml:space="preserve">Article 4</w:t>
+      </w:r>
       <w:r>
         <w:t>, with Maja Bak Herrie, material from the same AFP image pool has returned in a composite I did not make. The Guardian’s headline reads: “AI deepfakes come of age as billions prepare to vote in a bumper year of elections.”  Its composite puts the then US President Joe Biden behind a transparent layer of agents from The Synthetic</w:t>
       </w:r>
@@ -991,27 +973,23 @@
       <w:r>
         <w:t xml:space="preserve">Scaling runs backwards in </w:t>
       </w:r>
-      <w:hyperlink r:id="rId13" w:tooltip="Article 3: Isaac Asimov’s Incubation of Political AI: An Immanent Critique?; printed pp. 180–205">
-        <w:r>
-          <w:rPr>
-            <w:color w:val="000000"/>
-            <w:u w:val="single"/>
-          </w:rPr>
-          <w:t xml:space="preserve">Article 3</w:t>
-        </w:r>
-      </w:hyperlink>
+      <w:r>
+        <w:rPr>
+          <w:color w:val="000000"/>
+          <w:u w:val="single"/>
+        </w:rPr>
+        <w:t xml:space="preserve">Article 3</w:t>
+      </w:r>
       <w:r>
         <w:t xml:space="preserve">, through sci-fi author Isaac Asimov and the cultural inheritance through which AI is recognised as a politician, and politicians themselves suspected of being robotic. Asimov’s laws later recur in </w:t>
       </w:r>
-      <w:hyperlink r:id="rId16" w:tooltip="Article 7: Democracy as a Governance Algorithm: A Constraint Hierarchy for the AI Society; printed pp. 296–324">
-        <w:r>
-          <w:rPr>
-            <w:color w:val="000000"/>
-            <w:u w:val="single"/>
-          </w:rPr>
-          <w:t xml:space="preserve">Article 7</w:t>
-        </w:r>
-      </w:hyperlink>
+      <w:r>
+        <w:rPr>
+          <w:color w:val="000000"/>
+          <w:u w:val="single"/>
+        </w:rPr>
+        <w:t xml:space="preserve">Article 7</w:t>
+      </w:r>
       <w:r>
         <w:t>.</w:t>
       </w:r>
@@ -1023,15 +1001,13 @@
       <w:r>
         <w:t xml:space="preserve">In </w:t>
       </w:r>
-      <w:hyperlink r:id="rId14" w:tooltip="Article 5: Scripting the Spectacle: A Theory Tragedy; printed pp. 235–265">
-        <w:r>
-          <w:rPr>
-            <w:color w:val="000000"/>
-            <w:u w:val="single"/>
-          </w:rPr>
-          <w:t xml:space="preserve">Article 5</w:t>
-        </w:r>
-      </w:hyperlink>
+      <w:r>
+        <w:rPr>
+          <w:color w:val="000000"/>
+          <w:u w:val="single"/>
+        </w:rPr>
+        <w:t xml:space="preserve">Article 5</w:t>
+      </w:r>
       <w:r>
         <w:t>, my practice-based research begins to leak sideways. “We dared to play god with politics”, the performance says. In Theory Tragedy, the AI-written closing performance of the inaugural Aarhus Summit,</w:t>
       </w:r>
@@ -1183,15 +1159,13 @@
       <w:r>
         <w:t xml:space="preserve">In </w:t>
       </w:r>
-      <w:hyperlink r:id="rId15" w:tooltip="Article 6: Synthetic Chamber: Agentic Mediation in Representative Democracy; printed pp. 268–294">
-        <w:r>
-          <w:rPr>
-            <w:color w:val="000000"/>
-            <w:u w:val="single"/>
-          </w:rPr>
-          <w:t xml:space="preserve">Article 6</w:t>
-        </w:r>
-      </w:hyperlink>
+      <w:r>
+        <w:rPr>
+          <w:color w:val="000000"/>
+          <w:u w:val="single"/>
+        </w:rPr>
+        <w:t xml:space="preserve">Article 6</w:t>
+      </w:r>
       <w:r>
         <w:t>, political scientist Michal Malý and I bring the simulator out of the exhibition-event and towards a parliamentary proposal, a form to which The Synthetic Party remains constitutively alien.</w:t>
       </w:r>
@@ -1241,15 +1215,13 @@
       <w:r>
         <w:t xml:space="preserve">In </w:t>
       </w:r>
-      <w:hyperlink r:id="rId16" w:tooltip="Article 7: Democracy as a Governance Algorithm: A Constraint Hierarchy for the AI Society; printed pp. 296–324">
-        <w:r>
-          <w:rPr>
-            <w:color w:val="000000"/>
-            <w:u w:val="single"/>
-          </w:rPr>
-          <w:t xml:space="preserve">Article 7</w:t>
-        </w:r>
-      </w:hyperlink>
+      <w:r>
+        <w:rPr>
+          <w:color w:val="000000"/>
+          <w:u w:val="single"/>
+        </w:rPr>
+        <w:t xml:space="preserve">Article 7</w:t>
+      </w:r>
       <w:r>
         <w:t>, I take that declaration into a formal register, specifying democracy itself as a possible property of governance algorithms running on infrastructural substrates. Democracy as a governance algorithm.</w:t>
       </w:r>
@@ -1417,15 +1389,13 @@
       <w:r>
         <w:t xml:space="preserve">It's very different. I noticed in research, and it's mainly a political thesis, which we also became aware of here. But in </w:t>
       </w:r>
-      <w:hyperlink r:id="rId18" w:tooltip="Extended synthesis · RQ2">
-        <w:r>
-          <w:rPr>
-            <w:color w:val="000000"/>
-            <w:u w:val="single"/>
-          </w:rPr>
-          <w:t xml:space="preserve">research question 2</w:t>
-        </w:r>
-      </w:hyperlink>
+      <w:r>
+        <w:rPr>
+          <w:color w:val="000000"/>
+          <w:u w:val="single"/>
+        </w:rPr>
+        <w:t xml:space="preserve">research question 2</w:t>
+      </w:r>
       <w:r>
         <w:t>, this is mediated, this political question is answered through artistic and academic mediation. And so it's art and academia that mediate the political question of your project, as far as I read it. Is it correct?</w:t>
       </w:r>
@@ -1889,15 +1859,13 @@
       <w:r>
         <w:t xml:space="preserve">Yeah, yeah, in Adorno’s essay, Adorno does the same between Paul Valéry and Marcel Proust, which is here somewhere. And this is really curious, because Adorno makes the same reading of, no, you don't do a reading of Proust, but he does the same reading of Proust as you do of Clement Greenberg, that is synthetic art of Kitsch. And you write on </w:t>
       </w:r>
-      <w:hyperlink r:id="rId19" w:tooltip="Printed p. 54; PDF page 55">
-        <w:r>
-          <w:rPr>
-            <w:color w:val="000000"/>
-            <w:u w:val="single"/>
-          </w:rPr>
-          <w:t xml:space="preserve">page 54</w:t>
-        </w:r>
-      </w:hyperlink>
+      <w:r>
+        <w:rPr>
+          <w:color w:val="000000"/>
+          <w:u w:val="single"/>
+        </w:rPr>
+        <w:t xml:space="preserve">page 54</w:t>
+      </w:r>
       <w:r>
         <w:t>, two kinds of autonomy are at stake here. Artistic autonomy in Adorno's sense aspires to critical capacity through internal organization, and resists society by crystallizing form that refuses instrumental use. And on the other hand we have another kind of your version of Kitsch, or Proust, technological autonomy, the model's statistical independence from any program.</w:t>
       </w:r>
@@ -1989,27 +1957,23 @@
       <w:r>
         <w:t xml:space="preserve">But what I suspect is that there's an idea of interpretation here that is novel and you say once on </w:t>
       </w:r>
-      <w:hyperlink r:id="rId20" w:tooltip="Printed p. 29; PDF page 30">
-        <w:r>
-          <w:rPr>
-            <w:color w:val="000000"/>
-            <w:u w:val="single"/>
-          </w:rPr>
-          <w:t xml:space="preserve">page 29</w:t>
-        </w:r>
-      </w:hyperlink>
+      <w:r>
+        <w:rPr>
+          <w:color w:val="000000"/>
+          <w:u w:val="single"/>
+        </w:rPr>
+        <w:t xml:space="preserve">page 29</w:t>
+      </w:r>
       <w:r>
         <w:t xml:space="preserve"> in the thesis the database doesn't read, it matches. And this seems to be a kind of methodological point in the dissertation and I would like to end by hearing what you have to say because I said initially that there are some productive elements in the thesis as well which interest me a lot and which I think are a great contribution to scholarship, humanistic scholarship in general. As in the </w:t>
       </w:r>
-      <w:hyperlink r:id="rId18" w:tooltip="Extended synthesis · RQ2">
-        <w:r>
-          <w:rPr>
-            <w:color w:val="000000"/>
-            <w:u w:val="single"/>
-          </w:rPr>
-          <w:t xml:space="preserve">research question 2</w:t>
-        </w:r>
-      </w:hyperlink>
+      <w:r>
+        <w:rPr>
+          <w:color w:val="000000"/>
+          <w:u w:val="single"/>
+        </w:rPr>
+        <w:t xml:space="preserve">research question 2</w:t>
+      </w:r>
       <w:r>
         <w:t xml:space="preserve"> it is phrased through artistic and academic thinking or forms.</w:t>
       </w:r>
@@ -2583,27 +2547,23 @@
       <w:r>
         <w:t xml:space="preserve">Practically or theoretically? Practically because I needed to divert the media coverage into a specific corner. So if I said I have an AI politician that is awake 24-7, that can answer what everyone says, that can represent everyone, then I think that I would have explained the technology incorrectly and given a false promise. So I needed to find something specific and a bit paradoxical to how it could think. And in </w:t>
       </w:r>
-      <w:hyperlink r:id="rId11" w:tooltip="Article 1: The Synthetic Party &amp; Leader Lars: On Algorithmic Representation within Political Democracy; printed pp. 135–155">
-        <w:r>
-          <w:rPr>
-            <w:color w:val="000000"/>
-            <w:u w:val="single"/>
-          </w:rPr>
-          <w:t xml:space="preserve">Articles 1</w:t>
-        </w:r>
-      </w:hyperlink>
+      <w:r>
+        <w:rPr>
+          <w:color w:val="000000"/>
+          <w:u w:val="single"/>
+        </w:rPr>
+        <w:t xml:space="preserve">Articles 1</w:t>
+      </w:r>
       <w:r>
         <w:t xml:space="preserve"> and </w:t>
       </w:r>
-      <w:hyperlink r:id="rId12" w:tooltip="Article 2: A Model for Proustian Decay: Estimating the Value of Intelligence in the Age of Unreason; printed pp. 157–177">
-        <w:r>
-          <w:rPr>
-            <w:color w:val="000000"/>
-            <w:u w:val="single"/>
-          </w:rPr>
-          <w:t xml:space="preserve">2</w:t>
-        </w:r>
-      </w:hyperlink>
+      <w:r>
+        <w:rPr>
+          <w:color w:val="000000"/>
+          <w:u w:val="single"/>
+        </w:rPr>
+        <w:t xml:space="preserve">2</w:t>
+      </w:r>
       <w:r>
         <w:t xml:space="preserve"> I was going to say how that was also a way of trying to reverse the usual imaginary of how an AI acquires power. So in science fiction you usually say that at some time in history the machines will be intelligent and they will turn against us and they will take over the world.</w:t>
       </w:r>
@@ -3197,15 +3157,13 @@
       <w:r>
         <w:t xml:space="preserve">So how can I make it reflect the object? How can I use it for that? And that's why I then wrote the </w:t>
       </w:r>
-      <w:hyperlink r:id="rId11" w:tooltip="Article 1">
-        <w:r>
-          <w:rPr>
-            <w:color w:val="000000"/>
-            <w:u w:val="single"/>
-          </w:rPr>
-          <w:t xml:space="preserve">first article</w:t>
-        </w:r>
-      </w:hyperlink>
+      <w:r>
+        <w:rPr>
+          <w:color w:val="000000"/>
+          <w:u w:val="single"/>
+        </w:rPr>
+        <w:t xml:space="preserve">first article</w:t>
+      </w:r>
       <w:r>
         <w:t xml:space="preserve"> that also sort of set the tone for the dissertation, that this character of Computer Lars and I go into a discussion about these diagrams and say, what could they even mean for The Synthetic Party? So maybe those diagrams have a good and solid scientific explanation. I've also tried now to use some of the concepts, which are also, in my opinion, on the same level, you know, everything is formalization, to give back to political scientists. I can probably also find that useful for producing more knowledge, but then at the same time I would hold this disbelief to let things settle there.</w:t>
       </w:r>
@@ -3603,15 +3561,13 @@
       </w:r>
     </w:p>
     <w:p>
-      <w:hyperlink r:id="rId11">
-        <w:r>
-          <w:rPr>
-            <w:color w:val="000000"/>
-            <w:u w:val="single"/>
-          </w:rPr>
-          <w:t xml:space="preserve">Article 1</w:t>
-        </w:r>
-      </w:hyperlink>
+      <w:r>
+        <w:rPr>
+          <w:color w:val="000000"/>
+          <w:u w:val="single"/>
+        </w:rPr>
+        <w:t xml:space="preserve">Article 1</w:t>
+      </w:r>
       <w:r>
         <w:t xml:space="preserve">. Asker Bryld Staunæs &amp; Computer Lars. </w:t>
       </w:r>
@@ -3626,15 +3582,13 @@
       </w:r>
     </w:p>
     <w:p>
-      <w:hyperlink r:id="rId12">
-        <w:r>
-          <w:rPr>
-            <w:color w:val="000000"/>
-            <w:u w:val="single"/>
-          </w:rPr>
-          <w:t xml:space="preserve">Article 2</w:t>
-        </w:r>
-      </w:hyperlink>
+      <w:r>
+        <w:rPr>
+          <w:color w:val="000000"/>
+          <w:u w:val="single"/>
+        </w:rPr>
+        <w:t xml:space="preserve">Article 2</w:t>
+      </w:r>
       <w:r>
         <w:t xml:space="preserve">. Asker Bryld Staunæs &amp; Computer Lars. </w:t>
       </w:r>
@@ -3649,15 +3603,13 @@
       </w:r>
     </w:p>
     <w:p>
-      <w:hyperlink r:id="rId13">
-        <w:r>
-          <w:rPr>
-            <w:color w:val="000000"/>
-            <w:u w:val="single"/>
-          </w:rPr>
-          <w:t xml:space="preserve">Article 3</w:t>
-        </w:r>
-      </w:hyperlink>
+      <w:r>
+        <w:rPr>
+          <w:color w:val="000000"/>
+          <w:u w:val="single"/>
+        </w:rPr>
+        <w:t xml:space="preserve">Article 3</w:t>
+      </w:r>
       <w:r>
         <w:t xml:space="preserve">. Asker Bryld Staunæs. </w:t>
       </w:r>
@@ -3672,15 +3624,13 @@
       </w:r>
     </w:p>
     <w:p>
-      <w:hyperlink r:id="rId17">
-        <w:r>
-          <w:rPr>
-            <w:color w:val="000000"/>
-            <w:u w:val="single"/>
-          </w:rPr>
-          <w:t xml:space="preserve">Article 4</w:t>
-        </w:r>
-      </w:hyperlink>
+      <w:r>
+        <w:rPr>
+          <w:color w:val="000000"/>
+          <w:u w:val="single"/>
+        </w:rPr>
+        <w:t xml:space="preserve">Article 4</w:t>
+      </w:r>
       <w:r>
         <w:t xml:space="preserve">. Asker Bryld Staunæs &amp; Maja Bak Herrie. </w:t>
       </w:r>
@@ -3695,15 +3645,13 @@
       </w:r>
     </w:p>
     <w:p>
-      <w:hyperlink r:id="rId14">
-        <w:r>
-          <w:rPr>
-            <w:color w:val="000000"/>
-            <w:u w:val="single"/>
-          </w:rPr>
-          <w:t xml:space="preserve">Article 5</w:t>
-        </w:r>
-      </w:hyperlink>
+      <w:r>
+        <w:rPr>
+          <w:color w:val="000000"/>
+          <w:u w:val="single"/>
+        </w:rPr>
+        <w:t xml:space="preserve">Article 5</w:t>
+      </w:r>
       <w:r>
         <w:t xml:space="preserve">. Asker Bryld Staunæs. </w:t>
       </w:r>
@@ -3718,15 +3666,13 @@
       </w:r>
     </w:p>
     <w:p>
-      <w:hyperlink r:id="rId15">
-        <w:r>
-          <w:rPr>
-            <w:color w:val="000000"/>
-            <w:u w:val="single"/>
-          </w:rPr>
-          <w:t xml:space="preserve">Article 6</w:t>
-        </w:r>
-      </w:hyperlink>
+      <w:r>
+        <w:rPr>
+          <w:color w:val="000000"/>
+          <w:u w:val="single"/>
+        </w:rPr>
+        <w:t xml:space="preserve">Article 6</w:t>
+      </w:r>
       <w:r>
         <w:t xml:space="preserve">. Michal Malý &amp; Asker Bryld Staunæs. </w:t>
       </w:r>
@@ -3741,15 +3687,13 @@
       </w:r>
     </w:p>
     <w:p>
-      <w:hyperlink r:id="rId16">
-        <w:r>
-          <w:rPr>
-            <w:color w:val="000000"/>
-            <w:u w:val="single"/>
-          </w:rPr>
-          <w:t xml:space="preserve">Article 7</w:t>
-        </w:r>
-      </w:hyperlink>
+      <w:r>
+        <w:rPr>
+          <w:color w:val="000000"/>
+          <w:u w:val="single"/>
+        </w:rPr>
+        <w:t xml:space="preserve">Article 7</w:t>
+      </w:r>
       <w:r>
         <w:t xml:space="preserve">. Asker Bryld Staunæs. </w:t>
       </w:r>
@@ -3780,27 +3724,23 @@
       <w:r>
         <w:t xml:space="preserve">Geometry of the dissertation: Figure N.1, </w:t>
       </w:r>
-      <w:hyperlink r:id="rId21" w:tooltip="Printed folio 14">
-        <w:r>
-          <w:rPr>
-            <w:color w:val="000000"/>
-            <w:u w:val="single"/>
-          </w:rPr>
-          <w:t xml:space="preserve">p. 14</w:t>
-        </w:r>
-      </w:hyperlink>
+      <w:r>
+        <w:rPr>
+          <w:color w:val="000000"/>
+          <w:u w:val="single"/>
+        </w:rPr>
+        <w:t xml:space="preserve">p. 14</w:t>
+      </w:r>
       <w:r>
         <w:t xml:space="preserve">; directional variations, </w:t>
       </w:r>
-      <w:hyperlink r:id="rId22" w:tooltip="Printed folio 15">
-        <w:r>
-          <w:rPr>
-            <w:color w:val="000000"/>
-            <w:u w:val="single"/>
-          </w:rPr>
-          <w:t xml:space="preserve">pp. 15⁠–⁠16</w:t>
-        </w:r>
-      </w:hyperlink>
+      <w:r>
+        <w:rPr>
+          <w:color w:val="000000"/>
+          <w:u w:val="single"/>
+        </w:rPr>
+        <w:t xml:space="preserve">pp. 15⁠–⁠16</w:t>
+      </w:r>
       <w:r>
         <w:t>.</w:t>
       </w:r>
@@ -3814,15 +3754,13 @@
       <w:r>
         <w:t xml:space="preserve">Article 1: emotion analysis, figure and discussion, </w:t>
       </w:r>
-      <w:hyperlink r:id="rId23" w:tooltip="Printed folio 138">
-        <w:r>
-          <w:rPr>
-            <w:color w:val="000000"/>
-            <w:u w:val="single"/>
-          </w:rPr>
-          <w:t xml:space="preserve">pp. 138⁠–⁠139</w:t>
-        </w:r>
-      </w:hyperlink>
+      <w:r>
+        <w:rPr>
+          <w:color w:val="000000"/>
+          <w:u w:val="single"/>
+        </w:rPr>
+        <w:t xml:space="preserve">pp. 138⁠–⁠139</w:t>
+      </w:r>
       <w:r>
         <w:t>.</w:t>
       </w:r>
@@ -3836,27 +3774,23 @@
       <w:r>
         <w:t xml:space="preserve">Article 2: Proust quotation, </w:t>
       </w:r>
-      <w:hyperlink r:id="rId24" w:tooltip="Printed folio 160">
-        <w:r>
-          <w:rPr>
-            <w:color w:val="000000"/>
-            <w:u w:val="single"/>
-          </w:rPr>
-          <w:t xml:space="preserve">p. 160</w:t>
-        </w:r>
-      </w:hyperlink>
+      <w:r>
+        <w:rPr>
+          <w:color w:val="000000"/>
+          <w:u w:val="single"/>
+        </w:rPr>
+        <w:t xml:space="preserve">p. 160</w:t>
+      </w:r>
       <w:r>
         <w:t xml:space="preserve">; Figure 2.2, </w:t>
       </w:r>
-      <w:hyperlink r:id="rId25" w:tooltip="Printed folio 161">
-        <w:r>
-          <w:rPr>
-            <w:color w:val="000000"/>
-            <w:u w:val="single"/>
-          </w:rPr>
-          <w:t xml:space="preserve">p. 161</w:t>
-        </w:r>
-      </w:hyperlink>
+      <w:r>
+        <w:rPr>
+          <w:color w:val="000000"/>
+          <w:u w:val="single"/>
+        </w:rPr>
+        <w:t xml:space="preserve">p. 161</w:t>
+      </w:r>
       <w:r>
         <w:t>.</w:t>
       </w:r>
@@ -3870,27 +3804,23 @@
       <w:r>
         <w:t xml:space="preserve">Proust book photograph and permutation: Figure N.4, </w:t>
       </w:r>
-      <w:hyperlink r:id="rId26" w:tooltip="Printed folio 31">
-        <w:r>
-          <w:rPr>
-            <w:color w:val="000000"/>
-            <w:u w:val="single"/>
-          </w:rPr>
-          <w:t xml:space="preserve">p. 31</w:t>
-        </w:r>
-      </w:hyperlink>
+      <w:r>
+        <w:rPr>
+          <w:color w:val="000000"/>
+          <w:u w:val="single"/>
+        </w:rPr>
+        <w:t xml:space="preserve">p. 31</w:t>
+      </w:r>
       <w:r>
         <w:t xml:space="preserve">; analysis and photographed order, </w:t>
       </w:r>
-      <w:hyperlink r:id="rId27" w:tooltip="Printed folio 32">
-        <w:r>
-          <w:rPr>
-            <w:color w:val="000000"/>
-            <w:u w:val="single"/>
-          </w:rPr>
-          <w:t xml:space="preserve">pp. 32⁠–⁠35</w:t>
-        </w:r>
-      </w:hyperlink>
+      <w:r>
+        <w:rPr>
+          <w:color w:val="000000"/>
+          <w:u w:val="single"/>
+        </w:rPr>
+        <w:t xml:space="preserve">pp. 32⁠–⁠35</w:t>
+      </w:r>
       <w:r>
         <w:t>.</w:t>
       </w:r>
@@ -3904,39 +3834,33 @@
       <w:r>
         <w:t xml:space="preserve">Guardian composite: Figure N.3, </w:t>
       </w:r>
-      <w:hyperlink r:id="rId28" w:tooltip="Printed folio 27">
-        <w:r>
-          <w:rPr>
-            <w:color w:val="000000"/>
-            <w:u w:val="single"/>
-          </w:rPr>
-          <w:t xml:space="preserve">p. 27</w:t>
-        </w:r>
-      </w:hyperlink>
+      <w:r>
+        <w:rPr>
+          <w:color w:val="000000"/>
+          <w:u w:val="single"/>
+        </w:rPr>
+        <w:t xml:space="preserve">p. 27</w:t>
+      </w:r>
       <w:r>
         <w:t xml:space="preserve">; synthesis discussion, </w:t>
       </w:r>
-      <w:hyperlink r:id="rId29" w:tooltip="Printed folio 28">
-        <w:r>
-          <w:rPr>
-            <w:color w:val="000000"/>
-            <w:u w:val="single"/>
-          </w:rPr>
-          <w:t xml:space="preserve">pp. 28⁠–⁠29</w:t>
-        </w:r>
-      </w:hyperlink>
+      <w:r>
+        <w:rPr>
+          <w:color w:val="000000"/>
+          <w:u w:val="single"/>
+        </w:rPr>
+        <w:t xml:space="preserve">pp. 28⁠–⁠29</w:t>
+      </w:r>
       <w:r>
         <w:t xml:space="preserve">. The complete article is Article 4, </w:t>
       </w:r>
-      <w:hyperlink r:id="rId17" w:tooltip="Printed folio 207">
-        <w:r>
-          <w:rPr>
-            <w:color w:val="000000"/>
-            <w:u w:val="single"/>
-          </w:rPr>
-          <w:t xml:space="preserve">pp. 207⁠–⁠233</w:t>
-        </w:r>
-      </w:hyperlink>
+      <w:r>
+        <w:rPr>
+          <w:color w:val="000000"/>
+          <w:u w:val="single"/>
+        </w:rPr>
+        <w:t xml:space="preserve">pp. 207⁠–⁠233</w:t>
+      </w:r>
       <w:r>
         <w:t>.</w:t>
       </w:r>
@@ -3950,27 +3874,23 @@
       <w:r>
         <w:t xml:space="preserve">Wiktoria–Lars exchange, </w:t>
       </w:r>
-      <w:hyperlink r:id="rId30" w:tooltip="Printed folio 106">
-        <w:r>
-          <w:rPr>
-            <w:color w:val="000000"/>
-            <w:u w:val="single"/>
-          </w:rPr>
-          <w:t xml:space="preserve">pp. 106⁠–⁠107</w:t>
-        </w:r>
-      </w:hyperlink>
+      <w:r>
+        <w:rPr>
+          <w:color w:val="000000"/>
+          <w:u w:val="single"/>
+        </w:rPr>
+        <w:t xml:space="preserve">pp. 106⁠–⁠107</w:t>
+      </w:r>
       <w:r>
         <w:t xml:space="preserve">; social and technosocial sculpture, </w:t>
       </w:r>
-      <w:hyperlink r:id="rId31" w:tooltip="Printed folio 86">
-        <w:r>
-          <w:rPr>
-            <w:color w:val="000000"/>
-            <w:u w:val="single"/>
-          </w:rPr>
-          <w:t xml:space="preserve">pp. 86⁠–⁠94</w:t>
-        </w:r>
-      </w:hyperlink>
+      <w:r>
+        <w:rPr>
+          <w:color w:val="000000"/>
+          <w:u w:val="single"/>
+        </w:rPr>
+        <w:t xml:space="preserve">pp. 86⁠–⁠94</w:t>
+      </w:r>
       <w:r>
         <w:t>.</w:t>
       </w:r>
@@ -3984,27 +3904,23 @@
       <w:r>
         <w:t xml:space="preserve">Synthetic Summit Simulator and proposed Synthetic Chamber: Article 6, </w:t>
       </w:r>
-      <w:hyperlink r:id="rId15" w:tooltip="Printed folio 268">
-        <w:r>
-          <w:rPr>
-            <w:color w:val="000000"/>
-            <w:u w:val="single"/>
-          </w:rPr>
-          <w:t xml:space="preserve">pp. 268⁠–⁠294</w:t>
-        </w:r>
-      </w:hyperlink>
+      <w:r>
+        <w:rPr>
+          <w:color w:val="000000"/>
+          <w:u w:val="single"/>
+        </w:rPr>
+        <w:t xml:space="preserve">pp. 268⁠–⁠294</w:t>
+      </w:r>
       <w:r>
         <w:t xml:space="preserve">; constitutional workflow and uptake, </w:t>
       </w:r>
-      <w:hyperlink r:id="rId32" w:tooltip="Printed folio 279">
-        <w:r>
-          <w:rPr>
-            <w:color w:val="000000"/>
-            <w:u w:val="single"/>
-          </w:rPr>
-          <w:t xml:space="preserve">pp. 279⁠–⁠285</w:t>
-        </w:r>
-      </w:hyperlink>
+      <w:r>
+        <w:rPr>
+          <w:color w:val="000000"/>
+          <w:u w:val="single"/>
+        </w:rPr>
+        <w:t xml:space="preserve">pp. 279⁠–⁠285</w:t>
+      </w:r>
       <w:r>
         <w:t>.</w:t>
       </w:r>
@@ -4018,15 +3934,13 @@
       <w:r>
         <w:t xml:space="preserve">Opening formulation of democracy’s disproportion: printed </w:t>
       </w:r>
-      <w:hyperlink r:id="rId33" w:tooltip="Printed folio 6">
-        <w:r>
-          <w:rPr>
-            <w:color w:val="000000"/>
-            <w:u w:val="single"/>
-          </w:rPr>
-          <w:t xml:space="preserve">p. 6</w:t>
-        </w:r>
-      </w:hyperlink>
+      <w:r>
+        <w:rPr>
+          <w:color w:val="000000"/>
+          <w:u w:val="single"/>
+        </w:rPr>
+        <w:t xml:space="preserve">p. 6</w:t>
+      </w:r>
       <w:r>
         <w:t>.</w:t>
       </w:r>
@@ -4040,15 +3954,13 @@
       <w:r>
         <w:t xml:space="preserve">Abstract formulation of democracy’s disproportion: printed </w:t>
       </w:r>
-      <w:hyperlink r:id="rId34" w:tooltip="Printed folio 327">
-        <w:r>
-          <w:rPr>
-            <w:color w:val="000000"/>
-            <w:u w:val="single"/>
-          </w:rPr>
-          <w:t xml:space="preserve">p. 327</w:t>
-        </w:r>
-      </w:hyperlink>
+      <w:r>
+        <w:rPr>
+          <w:color w:val="000000"/>
+          <w:u w:val="single"/>
+        </w:rPr>
+        <w:t xml:space="preserve">p. 327</w:t>
+      </w:r>
       <w:r>
         <w:t>.</w:t>
       </w:r>
@@ -4062,15 +3974,13 @@
       <w:r>
         <w:t xml:space="preserve">The closing thesis formulation appears in the English abstract, </w:t>
       </w:r>
-      <w:hyperlink r:id="rId35" w:tooltip="Printed folio 330">
-        <w:r>
-          <w:rPr>
-            <w:color w:val="000000"/>
-            <w:u w:val="single"/>
-          </w:rPr>
-          <w:t xml:space="preserve">p. 330</w:t>
-        </w:r>
-      </w:hyperlink>
+      <w:r>
+        <w:rPr>
+          <w:color w:val="000000"/>
+          <w:u w:val="single"/>
+        </w:rPr>
+        <w:t xml:space="preserve">p. 330</w:t>
+      </w:r>
       <w:r>
         <w:t>. The spoken ending is the present defence formulation.</w:t>
       </w:r>
@@ -4084,27 +3994,23 @@
       <w:r>
         <w:t xml:space="preserve">Collective Resolution and democratic specification: synthesis, </w:t>
       </w:r>
-      <w:hyperlink r:id="rId36" w:tooltip="Printed folio 107">
-        <w:r>
-          <w:rPr>
-            <w:color w:val="000000"/>
-            <w:u w:val="single"/>
-          </w:rPr>
-          <w:t xml:space="preserve">pp. 107⁠–⁠109</w:t>
-        </w:r>
-      </w:hyperlink>
+      <w:r>
+        <w:rPr>
+          <w:color w:val="000000"/>
+          <w:u w:val="single"/>
+        </w:rPr>
+        <w:t xml:space="preserve">pp. 107⁠–⁠109</w:t>
+      </w:r>
       <w:r>
         <w:t xml:space="preserve">; Article 7, </w:t>
       </w:r>
-      <w:hyperlink r:id="rId16" w:tooltip="Printed folio 296">
-        <w:r>
-          <w:rPr>
-            <w:color w:val="000000"/>
-            <w:u w:val="single"/>
-          </w:rPr>
-          <w:t xml:space="preserve">pp. 296⁠–⁠324</w:t>
-        </w:r>
-      </w:hyperlink>
+      <w:r>
+        <w:rPr>
+          <w:color w:val="000000"/>
+          <w:u w:val="single"/>
+        </w:rPr>
+        <w:t xml:space="preserve">pp. 296⁠–⁠324</w:t>
+      </w:r>
       <w:r>
         <w:t>.</w:t>
       </w:r>
@@ -4118,15 +4024,13 @@
       <w:r>
         <w:t xml:space="preserve">Jan-Werner Müller’s reading of Asimov’s electoral computer and its limits: Article 3, </w:t>
       </w:r>
-      <w:hyperlink r:id="rId37" w:tooltip="Printed folio 197">
-        <w:r>
-          <w:rPr>
-            <w:color w:val="000000"/>
-            <w:u w:val="single"/>
-          </w:rPr>
-          <w:t xml:space="preserve">pp. 197⁠–⁠199</w:t>
-        </w:r>
-      </w:hyperlink>
+      <w:r>
+        <w:rPr>
+          <w:color w:val="000000"/>
+          <w:u w:val="single"/>
+        </w:rPr>
+        <w:t xml:space="preserve">pp. 197⁠–⁠199</w:t>
+      </w:r>
       <w:r>
         <w:t>.</w:t>
       </w:r>
@@ -4140,15 +4044,13 @@
       <w:r>
         <w:t xml:space="preserve">Emily Bender’s objection to The Synthetic Party is quoted and discussed on </w:t>
       </w:r>
-      <w:hyperlink r:id="rId38" w:tooltip="Printed folio 85">
-        <w:r>
-          <w:rPr>
-            <w:color w:val="000000"/>
-            <w:u w:val="single"/>
-          </w:rPr>
-          <w:t xml:space="preserve">p. 85</w:t>
-        </w:r>
-      </w:hyperlink>
+      <w:r>
+        <w:rPr>
+          <w:color w:val="000000"/>
+          <w:u w:val="single"/>
+        </w:rPr>
+        <w:t xml:space="preserve">p. 85</w:t>
+      </w:r>
       <w:r>
         <w:t>.</w:t>
       </w:r>
@@ -4162,15 +4064,13 @@
       <w:r>
         <w:t xml:space="preserve">Stiegler’s idiotextual geometry: Article 5, </w:t>
       </w:r>
-      <w:hyperlink r:id="rId39" w:tooltip="Printed folio 245">
-        <w:r>
-          <w:rPr>
-            <w:color w:val="000000"/>
-            <w:u w:val="single"/>
-          </w:rPr>
-          <w:t xml:space="preserve">pp. 245⁠–⁠247</w:t>
-        </w:r>
-      </w:hyperlink>
+      <w:r>
+        <w:rPr>
+          <w:color w:val="000000"/>
+          <w:u w:val="single"/>
+        </w:rPr>
+        <w:t xml:space="preserve">pp. 245⁠–⁠247</w:t>
+      </w:r>
       <w:r>
         <w:t>.</w:t>
       </w:r>
@@ -4184,27 +4084,23 @@
       <w:r>
         <w:t xml:space="preserve">Retro-futurist scenography, </w:t>
       </w:r>
-      <w:hyperlink r:id="rId40" w:tooltip="Printed folio 69">
-        <w:r>
-          <w:rPr>
-            <w:color w:val="000000"/>
-            <w:u w:val="single"/>
-          </w:rPr>
-          <w:t xml:space="preserve">p. 69</w:t>
-        </w:r>
-      </w:hyperlink>
+      <w:r>
+        <w:rPr>
+          <w:color w:val="000000"/>
+          <w:u w:val="single"/>
+        </w:rPr>
+        <w:t xml:space="preserve">p. 69</w:t>
+      </w:r>
       <w:r>
         <w:t xml:space="preserve">. The earlier formulation is “consumable futurisms”, </w:t>
       </w:r>
-      <w:hyperlink r:id="rId41" w:tooltip="Printed folio 58">
-        <w:r>
-          <w:rPr>
-            <w:color w:val="000000"/>
-            <w:u w:val="single"/>
-          </w:rPr>
-          <w:t xml:space="preserve">p. 58</w:t>
-        </w:r>
-      </w:hyperlink>
+      <w:r>
+        <w:rPr>
+          <w:color w:val="000000"/>
+          <w:u w:val="single"/>
+        </w:rPr>
+        <w:t xml:space="preserve">p. 58</w:t>
+      </w:r>
       <w:r>
         <w:t>.</w:t>
       </w:r>

</xml_diff>